<commit_message>
Strengthen package after alternate review
</commit_message>
<xml_diff>
--- a/templates/Westmount_Retainer_Agreement_Template.docx
+++ b/templates/Westmount_Retainer_Agreement_Template.docx
@@ -3,9 +3,6 @@
 <w:document xmlns:wpc="http://schemas.microsoft.com/office/word/2010/wordprocessingCanvas" xmlns:mo="http://schemas.microsoft.com/office/mac/office/2008/main" xmlns:mc="http://schemas.openxmlformats.org/markup-compatibility/2006" xmlns:mv="urn:schemas-microsoft-com:mac:vml" xmlns:o="urn:schemas-microsoft-com:office:office" xmlns:r="http://schemas.openxmlformats.org/officeDocument/2006/relationships" xmlns:m="http://schemas.openxmlformats.org/officeDocument/2006/math" xmlns:v="urn:schemas-microsoft-com:vml" xmlns:wp14="http://schemas.microsoft.com/office/word/2010/wordprocessingDrawing" xmlns:wp="http://schemas.openxmlformats.org/drawingml/2006/wordprocessingDrawing" xmlns:w10="urn:schemas-microsoft-com:office:word" xmlns:w="http://schemas.openxmlformats.org/wordprocessingml/2006/main" xmlns:w14="http://schemas.microsoft.com/office/word/2010/wordml" xmlns:wpg="http://schemas.microsoft.com/office/word/2010/wordprocessingGroup" xmlns:wpi="http://schemas.microsoft.com/office/word/2010/wordprocessingInk" xmlns:wne="http://schemas.microsoft.com/office/word/2006/wordml" xmlns:wps="http://schemas.microsoft.com/office/word/2010/wordprocessingShape" mc:Ignorable="w14 wp14">
   <w:body>
     <w:p>
-      <w:pPr>
-        <w:jc w:val="left"/>
-      </w:pPr>
       <w:r>
         <w:rPr>
           <w:rFonts w:ascii="Georgia" w:hAnsi="Georgia"/>
@@ -30,7 +27,7 @@
         <w:rPr>
           <w:rFonts w:ascii="Georgia" w:hAnsi="Georgia"/>
           <w:color w:val="081E35"/>
-          <w:sz w:val="52"/>
+          <w:sz w:val="50"/>
         </w:rPr>
         <w:t>Retainer Agreement Template</w:t>
       </w:r>
@@ -38,7 +35,6 @@
     <w:tbl>
       <w:tblPr>
         <w:tblW w:type="auto" w:w="0"/>
-        <w:tblLayout w:type="autofit"/>
         <w:tblLook w:firstColumn="1" w:firstRow="1" w:lastColumn="0" w:lastRow="0" w:noHBand="0" w:noVBand="1" w:val="04A0"/>
       </w:tblPr>
       <w:tblGrid>
@@ -63,15 +59,12 @@
           <w:rFonts w:ascii="Georgia" w:hAnsi="Georgia"/>
           <w:b/>
           <w:color w:val="081E35"/>
-          <w:sz w:val="30"/>
+          <w:sz w:val="28"/>
         </w:rPr>
         <w:t>Client and Matter Information</w:t>
       </w:r>
     </w:p>
     <w:p>
-      <w:pPr>
-        <w:spacing w:after="80"/>
-      </w:pPr>
       <w:r>
         <w:rPr>
           <w:rFonts w:ascii="Aptos" w:hAnsi="Aptos"/>
@@ -82,9 +75,6 @@
       </w:r>
     </w:p>
     <w:p>
-      <w:pPr>
-        <w:spacing w:after="80"/>
-      </w:pPr>
       <w:r>
         <w:rPr>
           <w:rFonts w:ascii="Aptos" w:hAnsi="Aptos"/>
@@ -95,9 +85,6 @@
       </w:r>
     </w:p>
     <w:p>
-      <w:pPr>
-        <w:spacing w:after="80"/>
-      </w:pPr>
       <w:r>
         <w:rPr>
           <w:rFonts w:ascii="Aptos" w:hAnsi="Aptos"/>
@@ -108,16 +95,13 @@
       </w:r>
     </w:p>
     <w:p>
-      <w:pPr>
-        <w:spacing w:after="80"/>
-      </w:pPr>
       <w:r>
         <w:rPr>
           <w:rFonts w:ascii="Aptos" w:hAnsi="Aptos"/>
           <w:color w:val="232A30"/>
           <w:sz w:val="21"/>
         </w:rPr>
-        <w:t>Date Opened: ______________________________</w:t>
+        <w:t>Effective Date: ___________________________</w:t>
       </w:r>
     </w:p>
     <w:p>
@@ -126,22 +110,19 @@
           <w:rFonts w:ascii="Georgia" w:hAnsi="Georgia"/>
           <w:b/>
           <w:color w:val="081E35"/>
-          <w:sz w:val="30"/>
+          <w:sz w:val="28"/>
         </w:rPr>
-        <w:t>Scope of Services</w:t>
+        <w:t>Engagement and Scope of Services</w:t>
       </w:r>
     </w:p>
     <w:p>
-      <w:pPr>
-        <w:spacing w:after="80"/>
-      </w:pPr>
       <w:r>
         <w:rPr>
           <w:rFonts w:ascii="Aptos" w:hAnsi="Aptos"/>
           <w:color w:val="232A30"/>
           <w:sz w:val="21"/>
         </w:rPr>
-        <w:t>This section defines the legal services to be provided, any exclusions, and the client responsibilities required to move the matter forward.</w:t>
+        <w:t>The Client retains the Firm to provide legal services in connection with the matter described above. The scope of services is limited to this matter unless a separate written engagement is executed.</w:t>
       </w:r>
     </w:p>
     <w:p>
@@ -150,48 +131,19 @@
           <w:rFonts w:ascii="Georgia" w:hAnsi="Georgia"/>
           <w:b/>
           <w:color w:val="081E35"/>
-          <w:sz w:val="30"/>
+          <w:sz w:val="28"/>
         </w:rPr>
-        <w:t>Fees, Retainer, and Billing</w:t>
+        <w:t>Lawyer Responsible for the File</w:t>
       </w:r>
     </w:p>
     <w:p>
-      <w:pPr>
-        <w:spacing w:after="80"/>
-      </w:pPr>
       <w:r>
         <w:rPr>
           <w:rFonts w:ascii="Aptos" w:hAnsi="Aptos"/>
           <w:color w:val="232A30"/>
           <w:sz w:val="21"/>
         </w:rPr>
-        <w:t>Initial retainer amount: $____________</w:t>
-      </w:r>
-    </w:p>
-    <w:p>
-      <w:pPr>
-        <w:spacing w:after="80"/>
-      </w:pPr>
-      <w:r>
-        <w:rPr>
-          <w:rFonts w:ascii="Aptos" w:hAnsi="Aptos"/>
-          <w:color w:val="232A30"/>
-          <w:sz w:val="21"/>
-        </w:rPr>
-        <w:t>Hourly / fixed fee arrangement: __________________</w:t>
-      </w:r>
-    </w:p>
-    <w:p>
-      <w:pPr>
-        <w:spacing w:after="80"/>
-      </w:pPr>
-      <w:r>
-        <w:rPr>
-          <w:rFonts w:ascii="Aptos" w:hAnsi="Aptos"/>
-          <w:color w:val="232A30"/>
-          <w:sz w:val="21"/>
-        </w:rPr>
-        <w:t>Billing frequency and payment terms: __________________</w:t>
+        <w:t>The lawyer responsible for the conduct of the matter is [Responsible Lawyer Name]. Other lawyers, students, law clerks, paralegals, or administrative staff may assist under supervision.</w:t>
       </w:r>
     </w:p>
     <w:p>
@@ -200,22 +152,185 @@
           <w:rFonts w:ascii="Georgia" w:hAnsi="Georgia"/>
           <w:b/>
           <w:color w:val="081E35"/>
-          <w:sz w:val="30"/>
+          <w:sz w:val="28"/>
         </w:rPr>
-        <w:t>Client Acknowledgement</w:t>
+        <w:t>Client Responsibilities</w:t>
       </w:r>
     </w:p>
     <w:p>
-      <w:pPr>
-        <w:spacing w:after="80"/>
-      </w:pPr>
       <w:r>
         <w:rPr>
           <w:rFonts w:ascii="Aptos" w:hAnsi="Aptos"/>
           <w:color w:val="232A30"/>
           <w:sz w:val="21"/>
         </w:rPr>
-        <w:t>Client signature: _________________________    Date: _______________</w:t>
+        <w:t>Provide complete and truthful information; respond promptly to communications; provide documents requested by the Firm; pay fees and disbursements when due; notify the Firm of contact-information changes.</w:t>
+      </w:r>
+    </w:p>
+    <w:p>
+      <w:r>
+        <w:rPr>
+          <w:rFonts w:ascii="Georgia" w:hAnsi="Georgia"/>
+          <w:b/>
+          <w:color w:val="081E35"/>
+          <w:sz w:val="28"/>
+        </w:rPr>
+        <w:t>Fees, Retainer, and Billing</w:t>
+      </w:r>
+    </w:p>
+    <w:p>
+      <w:r>
+        <w:rPr>
+          <w:rFonts w:ascii="Aptos" w:hAnsi="Aptos"/>
+          <w:color w:val="232A30"/>
+          <w:sz w:val="21"/>
+        </w:rPr>
+        <w:t>Initial retainer deposit: $____________</w:t>
+      </w:r>
+    </w:p>
+    <w:p>
+      <w:r>
+        <w:rPr>
+          <w:rFonts w:ascii="Aptos" w:hAnsi="Aptos"/>
+          <w:color w:val="232A30"/>
+          <w:sz w:val="21"/>
+        </w:rPr>
+        <w:t>Hourly / fixed fee / alternative arrangement: __________________</w:t>
+      </w:r>
+    </w:p>
+    <w:p>
+      <w:r>
+        <w:rPr>
+          <w:rFonts w:ascii="Aptos" w:hAnsi="Aptos"/>
+          <w:color w:val="232A30"/>
+          <w:sz w:val="21"/>
+        </w:rPr>
+        <w:t>Billing frequency: __________________</w:t>
+      </w:r>
+    </w:p>
+    <w:p>
+      <w:r>
+        <w:rPr>
+          <w:rFonts w:ascii="Aptos" w:hAnsi="Aptos"/>
+          <w:color w:val="232A30"/>
+          <w:sz w:val="21"/>
+        </w:rPr>
+        <w:t>Payment terms: __________________</w:t>
+      </w:r>
+    </w:p>
+    <w:p>
+      <w:r>
+        <w:rPr>
+          <w:rFonts w:ascii="Georgia" w:hAnsi="Georgia"/>
+          <w:b/>
+          <w:color w:val="081E35"/>
+          <w:sz w:val="28"/>
+        </w:rPr>
+        <w:t>Disbursements and Taxes</w:t>
+      </w:r>
+    </w:p>
+    <w:p>
+      <w:r>
+        <w:rPr>
+          <w:rFonts w:ascii="Aptos" w:hAnsi="Aptos"/>
+          <w:color w:val="232A30"/>
+          <w:sz w:val="21"/>
+        </w:rPr>
+        <w:t>The Client is responsible for applicable disbursements, taxes, search fees, registration fees, filing fees, couriers, experts, and other third-party expenses incurred in connection with the matter.</w:t>
+      </w:r>
+    </w:p>
+    <w:p>
+      <w:r>
+        <w:rPr>
+          <w:rFonts w:ascii="Georgia" w:hAnsi="Georgia"/>
+          <w:b/>
+          <w:color w:val="081E35"/>
+          <w:sz w:val="28"/>
+        </w:rPr>
+        <w:t>Confidentiality and Privilege</w:t>
+      </w:r>
+    </w:p>
+    <w:p>
+      <w:r>
+        <w:rPr>
+          <w:rFonts w:ascii="Aptos" w:hAnsi="Aptos"/>
+          <w:color w:val="232A30"/>
+          <w:sz w:val="21"/>
+        </w:rPr>
+        <w:t>Communications between the Client and Firm are confidential and may be protected by solicitor-client privilege, subject to applicable law and professional obligations.</w:t>
+      </w:r>
+    </w:p>
+    <w:p>
+      <w:r>
+        <w:rPr>
+          <w:rFonts w:ascii="Georgia" w:hAnsi="Georgia"/>
+          <w:b/>
+          <w:color w:val="081E35"/>
+          <w:sz w:val="28"/>
+        </w:rPr>
+        <w:t>Conflicts of Interest</w:t>
+      </w:r>
+    </w:p>
+    <w:p>
+      <w:r>
+        <w:rPr>
+          <w:rFonts w:ascii="Aptos" w:hAnsi="Aptos"/>
+          <w:color w:val="232A30"/>
+          <w:sz w:val="21"/>
+        </w:rPr>
+        <w:t>The Firm will conduct conflict screening based on the information provided. The Client must advise the Firm of all related parties and any potential conflict as soon as known.</w:t>
+      </w:r>
+    </w:p>
+    <w:p>
+      <w:r>
+        <w:rPr>
+          <w:rFonts w:ascii="Georgia" w:hAnsi="Georgia"/>
+          <w:b/>
+          <w:color w:val="081E35"/>
+          <w:sz w:val="28"/>
+        </w:rPr>
+        <w:t>Termination</w:t>
+      </w:r>
+    </w:p>
+    <w:p>
+      <w:r>
+        <w:rPr>
+          <w:rFonts w:ascii="Aptos" w:hAnsi="Aptos"/>
+          <w:color w:val="232A30"/>
+          <w:sz w:val="21"/>
+        </w:rPr>
+        <w:t>The Client may terminate the engagement on written notice. The Firm may withdraw where permitted by professional rules, including non-payment, loss of confidence, or failure to provide instructions.</w:t>
+      </w:r>
+    </w:p>
+    <w:p>
+      <w:r>
+        <w:rPr>
+          <w:rFonts w:ascii="Georgia" w:hAnsi="Georgia"/>
+          <w:b/>
+          <w:color w:val="081E35"/>
+          <w:sz w:val="28"/>
+        </w:rPr>
+        <w:t>Acknowledgement and Signatures</w:t>
+      </w:r>
+    </w:p>
+    <w:p>
+      <w:r>
+        <w:rPr>
+          <w:rFonts w:ascii="Aptos" w:hAnsi="Aptos"/>
+          <w:color w:val="232A30"/>
+          <w:sz w:val="21"/>
+        </w:rPr>
+        <w:t>Client Signature: _________________________ Date: ___________</w:t>
+      </w:r>
+    </w:p>
+    <w:p>
+      <w:r>
+        <w:rPr>
+          <w:rFonts w:ascii="Aptos" w:hAnsi="Aptos"/>
+          <w:color w:val="232A30"/>
+          <w:sz w:val="21"/>
+        </w:rPr>
+        <w:t>Firm Signature: __________________________ Date: ___________</w:t>
       </w:r>
     </w:p>
     <w:sectPr>

</xml_diff>